<commit_message>
Add final project description and update report title for PM2.5 forecasting analysis
</commit_message>
<xml_diff>
--- a/FSB/MLE501/G3_ASSIGNMENT/docs/G3_MLE501_REPORT.docx
+++ b/FSB/MLE501/G3_ASSIGNMENT/docs/G3_MLE501_REPORT.docx
@@ -19,8 +19,19 @@
           <w:color w:val="000000" w:themeColor="text1"/>
           <w:sz w:val="40"/>
           <w:szCs w:val="40"/>
-        </w:rPr>
-        <w:t>Comprehensive Analysis and Forecasting of PM2.5 Concentrations in Hanoi Utilizing Machine Learning Regression Ensembles</w:t>
+          <w:lang w:val="vi-VN"/>
+        </w:rPr>
+        <w:t xml:space="preserve"> </w:t>
+      </w:r>
+      <w:r>
+        <w:rPr>
+          <w:b/>
+          <w:bCs/>
+          <w:color w:val="000000" w:themeColor="text1"/>
+          <w:sz w:val="40"/>
+          <w:szCs w:val="40"/>
+        </w:rPr>
+        <w:t xml:space="preserve"> Utilizing Machine Learning Regression Ensembles</w:t>
       </w:r>
     </w:p>
     <w:p>
@@ -198,14 +209,14 @@
         <w:rPr>
           <w:color w:val="000000" w:themeColor="text1"/>
         </w:rPr>
-        <w:t xml:space="preserve">The primary pollutant of interest in this study is Particulate Matter 2.5 (PM2.5). Defined as atmospheric particulate matter with an aerodynamic diameter of less than 2.5 micrometers, these particles are microscopic enough to bypass the body's natural defense </w:t>
+        <w:t xml:space="preserve">The primary pollutant of interest in this study is Particulate Matter 2.5 (PM2.5). Defined as atmospheric particulate matter with an aerodynamic diameter of less than 2.5 micrometers, these particles are microscopic enough to bypass the body's natural defense mechanisms in the nose and throat. Once inhaled, they penetrate deep into the alveolar regions of the lungs and can enter the circulatory system. The health implications are profound and well-documented.1 Long-term exposure to elevated PM2.5 levels is causally </w:t>
       </w:r>
       <w:r>
         <w:rPr>
           <w:color w:val="000000" w:themeColor="text1"/>
         </w:rPr>
         <w:lastRenderedPageBreak/>
-        <w:t>mechanisms in the nose and throat. Once inhaled, they penetrate deep into the alveolar regions of the lungs and can enter the circulatory system. The health implications are profound and well-documented.1 Long-term exposure to elevated PM2.5 levels is causally linked to a spectrum of acute and chronic health conditions, including respiratory infections, exacerbation of asthma, cardiovascular diseases, stroke, and lung cancer.</w:t>
+        <w:t>linked to a spectrum of acute and chronic health conditions, including respiratory infections, exacerbation of asthma, cardiovascular diseases, stroke, and lung cancer.</w:t>
       </w:r>
     </w:p>
     <w:p>
@@ -383,14 +394,14 @@
         <w:rPr>
           <w:color w:val="000000" w:themeColor="text1"/>
         </w:rPr>
-        <w:t xml:space="preserve">The primary motivation driving this research is the development of a scientifically robust, operationally viable early warning system. Current monitoring infrastructure provides real-time data, but reactive measures are often insufficient to protect public health. A reliable forecast allows for proactive intervention. For government agencies, accurate 7-day forecasts provide the necessary lead time to implement short-term pollution control </w:t>
+        <w:t xml:space="preserve">The primary motivation driving this research is the development of a scientifically robust, operationally viable early warning system. Current monitoring infrastructure provides real-time data, but reactive measures are often insufficient to protect public health. A reliable forecast allows for proactive intervention. For government agencies, accurate 7-day forecasts provide the necessary lead time to implement short-term pollution control measures, such as temporary traffic restrictions, dust control mandates for construction sites, or advisories for industrial curtailment. For the general public, these forecasts </w:t>
       </w:r>
       <w:r>
         <w:rPr>
           <w:color w:val="000000" w:themeColor="text1"/>
         </w:rPr>
         <w:lastRenderedPageBreak/>
-        <w:t>measures, such as temporary traffic restrictions, dust control mandates for construction sites, or advisories for industrial curtailment. For the general public, these forecasts empower individuals to make informed decisions, such as rescheduling outdoor activities or utilizing protective equipment like N95 masks during predicted haze events.</w:t>
+        <w:t>empower individuals to make informed decisions, such as rescheduling outdoor activities or utilizing protective equipment like N95 masks during predicted haze events.</w:t>
       </w:r>
     </w:p>
     <w:p>
@@ -613,15 +624,7 @@
           <w:bCs/>
           <w:color w:val="000000" w:themeColor="text1"/>
         </w:rPr>
-        <w:t xml:space="preserve">The reliability of any machine learning model is intrinsically tied to the quality and granularity of the data upon which it is trained. This project implements a sophisticated </w:t>
-      </w:r>
-      <w:r>
-        <w:rPr>
-          <w:bCs/>
-          <w:color w:val="000000" w:themeColor="text1"/>
-        </w:rPr>
-        <w:lastRenderedPageBreak/>
-        <w:t>data acquisition architecture designed to handle the specific challenges of retrieving historical meteorological and air quality data via a third-party API.</w:t>
+        <w:t>The reliability of any machine learning model is intrinsically tied to the quality and granularity of the data upon which it is trained. This project implements a sophisticated data acquisition architecture designed to handle the specific challenges of retrieving historical meteorological and air quality data via a third-party API.</w:t>
       </w:r>
     </w:p>
     <w:p>
@@ -6786,6 +6789,9 @@
         <w:jc w:val="both"/>
       </w:pPr>
       <w:r>
+        <w:rPr>
+          <w:noProof/>
+        </w:rPr>
         <w:lastRenderedPageBreak/>
         <w:drawing>
           <wp:inline distT="0" distB="0" distL="0" distR="0" wp14:anchorId="14BFC81A" wp14:editId="0222CF3D">

</xml_diff>